<commit_message>
rapport toegevoegd + agente notulen
</commit_message>
<xml_diff>
--- a/Agenda+Notulen/notulen en agenda P4P-project 15-05-2012.docx
+++ b/Agenda+Notulen/notulen en agenda P4P-project 15-05-2012.docx
@@ -1137,8 +1137,6 @@
           <w:sz w:val="20"/>
         </w:rPr>
       </w:pPr>
-      <w:bookmarkStart w:id="0" w:name="_GoBack"/>
-      <w:bookmarkEnd w:id="0"/>
     </w:p>
     <w:p>
       <w:pPr>
@@ -1189,6 +1187,20 @@
         </w:rPr>
         <w:t>De vergadering wordt gesloten.</w:t>
       </w:r>
+    </w:p>
+    <w:p>
+      <w:pPr>
+        <w:tabs>
+          <w:tab w:val="left" w:pos="3544"/>
+        </w:tabs>
+        <w:jc w:val="both"/>
+        <w:rPr>
+          <w:rFonts w:ascii="Arial" w:hAnsi="Arial" w:cs="Arial"/>
+          <w:sz w:val="20"/>
+        </w:rPr>
+      </w:pPr>
+      <w:bookmarkStart w:id="0" w:name="_GoBack"/>
+      <w:bookmarkEnd w:id="0"/>
     </w:p>
     <w:sectPr>
       <w:footerReference w:type="default" r:id="rId8"/>
@@ -3073,6 +3085,11 @@
       <w:contextualSpacing/>
     </w:pPr>
   </w:style>
+  <w:style w:type="character" w:styleId="Regelnummer">
+    <w:name w:val="line number"/>
+    <w:basedOn w:val="Standaardalinea-lettertype"/>
+    <w:rsid w:val="008941CB"/>
+  </w:style>
 </w:styles>
 </file>
 
@@ -3988,6 +4005,11 @@
       <w:ind w:left="720"/>
       <w:contextualSpacing/>
     </w:pPr>
+  </w:style>
+  <w:style w:type="character" w:styleId="Regelnummer">
+    <w:name w:val="line number"/>
+    <w:basedOn w:val="Standaardalinea-lettertype"/>
+    <w:rsid w:val="008941CB"/>
   </w:style>
 </w:styles>
 </file>

</xml_diff>